<commit_message>
update talk.docx and talk.md
</commit_message>
<xml_diff>
--- a/talk.docx
+++ b/talk.docx
@@ -610,6 +610,886 @@
           <w:sz w:val="30"/>
         </w:rPr>
         <w:t>DEMO</w:t>
+      </w:r>
+    </w:p>
+    <w:p>
+      <w:pPr>
+        <w:spacing w:before="360"/>
+      </w:pPr>
+      <w:r>
+        <w:rPr>
+          <w:b/>
+        </w:rPr>
+        <w:t xml:space="preserve">Beat 0 — Framing</w:t>
+      </w:r>
+    </w:p>
+    <w:p>
+      <w:pPr>
+        <w:spacing w:before="200"/>
+      </w:pPr>
+      <w:r>
+        <w:t xml:space="preserve">For the time remaining I'm going to walk through my workflow for discovering the hidden specification, and then making changes against it.</w:t>
+      </w:r>
+    </w:p>
+    <w:p>
+      <w:pPr>
+        <w:spacing w:before="200"/>
+      </w:pPr>
+      <w:r>
+        <w:t xml:space="preserve">The foundation is characterization tests. Michael Feathers introduced the term in 2004. A characterization test pins behavior as-is. It makes no claim about correctness. It holds everything in place with equal weight.</w:t>
+      </w:r>
+    </w:p>
+    <w:p>
+      <w:pPr>
+        <w:spacing w:before="200"/>
+      </w:pPr>
+      <w:r>
+        <w:t xml:space="preserve">That last part is the problem, and it's what the rest of this is about. We're going to point that flat, undifferentiated pin at a pragmatic version of correct.</w:t>
+      </w:r>
+    </w:p>
+    <w:p>
+      <w:pPr>
+        <w:spacing w:before="200"/>
+      </w:pPr>
+      <w:r>
+        <w:t xml:space="preserve">The edges tell us what actually matters.</w:t>
+      </w:r>
+    </w:p>
+    <w:p>
+      <w:pPr>
+        <w:spacing w:before="360"/>
+      </w:pPr>
+      <w:r>
+        <w:rPr>
+          <w:b/>
+        </w:rPr>
+        <w:t xml:space="preserve">Beat 1 — Housekeeping</w:t>
+      </w:r>
+    </w:p>
+    <w:p>
+      <w:pPr>
+        <w:spacing w:before="200"/>
+      </w:pPr>
+      <w:r>
+        <w:rPr>
+          <w:b/>
+          <w:i/>
+        </w:rPr>
+        <w:t xml:space="preserve">[Open terminal.]</w:t>
+      </w:r>
+    </w:p>
+    <w:p>
+      <w:pPr>
+        <w:spacing w:before="200"/>
+      </w:pPr>
+      <w:r>
+        <w:t xml:space="preserve">Two notes before I start.</w:t>
+      </w:r>
+    </w:p>
+    <w:p>
+      <w:pPr>
+        <w:spacing w:before="200"/>
+      </w:pPr>
+      <w:r>
+        <w:t xml:space="preserve">First, the repository. This is a scaled-down, IP-scrubbed version of the ingestion app I've been describing, recast into a different domain. Same pathologies, approved for the stage.</w:t>
+      </w:r>
+    </w:p>
+    <w:p>
+      <w:pPr>
+        <w:spacing w:before="200"/>
+      </w:pPr>
+      <w:r>
+        <w:t xml:space="preserve">Second, tooling. The terminal is Warp. Warp sells its own AI subscription and can act as a harness; I don't use it that way anymore. My harness is Oh My Pi, which is subscription-agnostic, and I'm driving it with a Claude subscription.</w:t>
+      </w:r>
+    </w:p>
+    <w:p>
+      <w:pPr>
+        <w:spacing w:before="200"/>
+      </w:pPr>
+      <w:r>
+        <w:t xml:space="preserve">And this is a fast-forward with markers. The original session ran over ninety minutes. The agent turns are the reason I'm not doing this live.</w:t>
+      </w:r>
+    </w:p>
+    <w:p>
+      <w:pPr>
+        <w:spacing w:before="360"/>
+      </w:pPr>
+      <w:r>
+        <w:rPr>
+          <w:b/>
+        </w:rPr>
+        <w:t xml:space="preserve">Beat 2 — `/init`</w:t>
+      </w:r>
+    </w:p>
+    <w:p>
+      <w:pPr>
+        <w:spacing w:before="200"/>
+      </w:pPr>
+      <w:r>
+        <w:rPr>
+          <w:b/>
+          <w:i/>
+        </w:rPr>
+        <w:t xml:space="preserve">[Marker: init.]</w:t>
+      </w:r>
+    </w:p>
+    <w:p>
+      <w:pPr>
+        <w:spacing w:before="200"/>
+      </w:pPr>
+      <w:r>
+        <w:t xml:space="preserve">First time in a new repository, this is what you do regardless of harness or model. There's a command like this.</w:t>
+      </w:r>
+    </w:p>
+    <w:p>
+      <w:pPr>
+        <w:spacing w:before="120"/>
+      </w:pPr>
+      <w:r>
+        <w:rPr>
+          <w:rFonts w:ascii="Courier New" w:hAnsi="Courier New"/>
+        </w:rPr>
+        <w:t xml:space="preserve">/init</w:t>
+      </w:r>
+    </w:p>
+    <w:p>
+      <w:pPr>
+        <w:spacing w:before="200"/>
+      </w:pPr>
+      <w:r>
+        <w:t xml:space="preserve">The agent generates a repository guidelines document. Project overview. Architecture and data flow, sometimes with diagrams. Local development workflow. The state of the tests and how to run them, if they exist. Sometimes gotchas — some harnesses call them footguns.</w:t>
+      </w:r>
+    </w:p>
+    <w:p>
+      <w:pPr>
+        <w:spacing w:before="200"/>
+      </w:pPr>
+      <w:r>
+        <w:rPr>
+          <w:b/>
+          <w:i/>
+        </w:rPr>
+        <w:t xml:space="preserve">[Open `evsc-agent-run/AGENTS.md`. Scroll the gotchas section.]</w:t>
+      </w:r>
+    </w:p>
+    <w:p>
+      <w:pPr>
+        <w:spacing w:before="200"/>
+      </w:pPr>
+      <w:r>
+        <w:t xml:space="preserve">This is the README for your agent. But read it yourself. It's enlightening.</w:t>
+      </w:r>
+    </w:p>
+    <w:p>
+      <w:pPr>
+        <w:spacing w:before="360"/>
+      </w:pPr>
+      <w:r>
+        <w:rPr>
+          <w:b/>
+        </w:rPr>
+        <w:t xml:space="preserve">Beat 3 — Docs for humans</w:t>
+      </w:r>
+    </w:p>
+    <w:p>
+      <w:pPr>
+        <w:spacing w:before="200"/>
+      </w:pPr>
+      <w:r>
+        <w:rPr>
+          <w:b/>
+          <w:i/>
+        </w:rPr>
+        <w:t xml:space="preserve">[Marker: docs.]</w:t>
+      </w:r>
+    </w:p>
+    <w:p>
+      <w:pPr>
+        <w:spacing w:before="200"/>
+      </w:pPr>
+      <w:r>
+        <w:t xml:space="preserve">Having prioritized the agent's context, now I have it build up mine.</w:t>
+      </w:r>
+    </w:p>
+    <w:p>
+      <w:pPr>
+        <w:spacing w:before="200"/>
+      </w:pPr>
+      <w:r>
+        <w:rPr>
+          <w:b/>
+          <w:i/>
+        </w:rPr>
+        <w:t xml:space="preserve">[Paste the docs prompt from `PROMPTS.md`.]</w:t>
+      </w:r>
+    </w:p>
+    <w:p>
+      <w:pPr>
+        <w:spacing w:before="200"/>
+      </w:pPr>
+      <w:r>
+        <w:t xml:space="preserve">I ask for a </w:t>
+      </w:r>
+      <w:r>
+        <w:rPr>
+          <w:rFonts w:ascii="Courier New" w:hAnsi="Courier New"/>
+        </w:rPr>
+        <w:t xml:space="preserve">docs/</w:t>
+      </w:r>
+      <w:r>
+        <w:t xml:space="preserve"> directory aimed at a human who doesn't have their bearings in this repo. Domain overview. Sequence diagrams. Entity relationships. Architecture. And I tell it to link them from the README and from AGENTS.md — they're mainly for me, but they're useful to the agents too.</w:t>
+      </w:r>
+    </w:p>
+    <w:p>
+      <w:pPr>
+        <w:spacing w:before="200"/>
+      </w:pPr>
+      <w:r>
+        <w:rPr>
+          <w:b/>
+          <w:i/>
+        </w:rPr>
+        <w:t xml:space="preserve">[Open `evsc-agent-run/docs/domain-overview.md`. Land on level 0.]</w:t>
+      </w:r>
+    </w:p>
+    <w:p>
+      <w:pPr>
+        <w:spacing w:before="200"/>
+      </w:pPr>
+      <w:r>
+        <w:t xml:space="preserve">My favorite is the domain overview. I ask for the application's place in the broader system at increasing levels of detail.</w:t>
+      </w:r>
+    </w:p>
+    <w:p>
+      <w:pPr>
+        <w:spacing w:before="200"/>
+      </w:pPr>
+      <w:r>
+        <w:t xml:space="preserve">Level zero is how you describe your job at your kid's school function. Somebody asks what you do. You don't open with jargon. You say something like this — electric vehicle chargers report how much power they've moved, whether anything is plugged in, whether they're broken. Those messages queue up. This application picks them up, makes sense of them, and puts them somewhere.</w:t>
+      </w:r>
+    </w:p>
+    <w:p>
+      <w:pPr>
+        <w:spacing w:before="200"/>
+      </w:pPr>
+      <w:r>
+        <w:rPr>
+          <w:b/>
+          <w:i/>
+        </w:rPr>
+        <w:t xml:space="preserve">[Scroll to a deeper level.]</w:t>
+      </w:r>
+    </w:p>
+    <w:p>
+      <w:pPr>
+        <w:spacing w:before="200"/>
+      </w:pPr>
+      <w:r>
+        <w:t xml:space="preserve">And it goes down from there.</w:t>
+      </w:r>
+    </w:p>
+    <w:p>
+      <w:pPr>
+        <w:spacing w:before="200"/>
+      </w:pPr>
+      <w:r>
+        <w:t xml:space="preserve">The real purpose of this stage is to get *you* equipped to exercise judgment over everything the model hands you after this point. It's about shortening that runway.</w:t>
+      </w:r>
+    </w:p>
+    <w:p>
+      <w:pPr>
+        <w:spacing w:before="200"/>
+      </w:pPr>
+      <w:r>
+        <w:t xml:space="preserve">Is it circular? Somewhat. Two mitigations. Have a second agent do an adversarial review of the first one's output — I'm a heavy user of this. And demand the evidence: show me the proof of that claim.</w:t>
+      </w:r>
+    </w:p>
+    <w:p>
+      <w:pPr>
+        <w:spacing w:before="200"/>
+      </w:pPr>
+      <w:r>
+        <w:t xml:space="preserve">Because the worst mistakes I have made with AI, and the worst I've watched other people make, all came from the same place. Trusting a plausible assertion that was built on inference.</w:t>
+      </w:r>
+    </w:p>
+    <w:p>
+      <w:pPr>
+        <w:spacing w:before="360"/>
+      </w:pPr>
+      <w:r>
+        <w:rPr>
+          <w:b/>
+        </w:rPr>
+        <w:t xml:space="preserve">Beat 4 — The edge inventory</w:t>
+      </w:r>
+    </w:p>
+    <w:p>
+      <w:pPr>
+        <w:spacing w:before="200"/>
+      </w:pPr>
+      <w:r>
+        <w:rPr>
+          <w:b/>
+          <w:i/>
+        </w:rPr>
+        <w:t xml:space="preserve">[Marker: integration points.]</w:t>
+      </w:r>
+    </w:p>
+    <w:p>
+      <w:pPr>
+        <w:spacing w:before="200"/>
+      </w:pPr>
+      <w:r>
+        <w:rPr>
+          <w:b/>
+          <w:i/>
+        </w:rPr>
+        <w:t xml:space="preserve">[Paste the integration points prompt.]</w:t>
+      </w:r>
+    </w:p>
+    <w:p>
+      <w:pPr>
+        <w:spacing w:before="200"/>
+      </w:pPr>
+      <w:r>
+        <w:t xml:space="preserve">Now I have it document every integration point in one file. Database writes. API calls. Message passes. File writes. Environment. And explicitly: anything I might not be aware of.</w:t>
+      </w:r>
+    </w:p>
+    <w:p>
+      <w:pPr>
+        <w:spacing w:before="200"/>
+      </w:pPr>
+      <w:r>
+        <w:rPr>
+          <w:b/>
+          <w:i/>
+        </w:rPr>
+        <w:t xml:space="preserve">[Open `evsc-agent-run/docs/integration-points.md`.]</w:t>
+      </w:r>
+    </w:p>
+    <w:p>
+      <w:pPr>
+        <w:spacing w:before="200"/>
+      </w:pPr>
+      <w:r>
+        <w:t xml:space="preserve">Every SQL statement by id. The one outbound HTTP call. Environment variables. Clocks. Cross-team contracts. A risk register.</w:t>
+      </w:r>
+    </w:p>
+    <w:p>
+      <w:pPr>
+        <w:spacing w:before="200"/>
+      </w:pPr>
+      <w:r>
+        <w:rPr>
+          <w:b/>
+        </w:rPr>
+        <w:t xml:space="preserve">Read this file.</w:t>
+      </w:r>
+      <w:r>
+        <w:t xml:space="preserve"> Pass it around your team. If something here smells off, you're missing context — go get it. If something is *missing*, you will find out later, and it will be expensive. This is the inventory everything downstream is built against.</w:t>
+      </w:r>
+    </w:p>
+    <w:p>
+      <w:pPr>
+        <w:spacing w:before="360"/>
+      </w:pPr>
+      <w:r>
+        <w:rPr>
+          <w:b/>
+        </w:rPr>
+        <w:t xml:space="preserve">Beat 5 — Building the suite</w:t>
+      </w:r>
+    </w:p>
+    <w:p>
+      <w:pPr>
+        <w:spacing w:before="200"/>
+      </w:pPr>
+      <w:r>
+        <w:rPr>
+          <w:b/>
+          <w:i/>
+        </w:rPr>
+        <w:t xml:space="preserve">[Marker: characterization.]</w:t>
+      </w:r>
+    </w:p>
+    <w:p>
+      <w:pPr>
+        <w:spacing w:before="200"/>
+      </w:pPr>
+      <w:r>
+        <w:rPr>
+          <w:b/>
+          <w:i/>
+        </w:rPr>
+        <w:t xml:space="preserve">[Paste the characterization prompt.]</w:t>
+      </w:r>
+    </w:p>
+    <w:p>
+      <w:pPr>
+        <w:spacing w:before="200"/>
+      </w:pPr>
+      <w:r>
+        <w:t xml:space="preserve">Now build the suite against that inventory. Capture behavior at the edges so that everything externally observable is pinned. Because it's *externally* observable, I tell it the test code must be language-agnostic — black box. These tests should catch any change to outward behavior and let me change everything on the inside.</w:t>
+      </w:r>
+    </w:p>
+    <w:p>
+      <w:pPr>
+        <w:spacing w:before="200"/>
+      </w:pPr>
+      <w:r>
+        <w:t xml:space="preserve">For the database: use a disposable container. If you have read access to a production-quality schema, replicate it exactly. If you don't, infer the structure from usage. API calls and message passes can be mocked — but preserve the payloads and assert on them.</w:t>
+      </w:r>
+    </w:p>
+    <w:p>
+      <w:pPr>
+        <w:spacing w:before="200"/>
+      </w:pPr>
+      <w:r>
+        <w:t xml:space="preserve">And one line that's doing more work than it looks like: every assertion must be evaluated at the end of a unit of processing. Without that, you get assertions on intermediate state, and intermediate state is mechanism, not specification. Then the suite fails on every honest refactor and the effort dies.</w:t>
+      </w:r>
+    </w:p>
+    <w:p>
+      <w:pPr>
+        <w:spacing w:before="200"/>
+      </w:pPr>
+      <w:r>
+        <w:rPr>
+          <w:b/>
+          <w:i/>
+        </w:rPr>
+        <w:t xml:space="preserve">[Open `evsc-agent-run/tests/README.md`.]</w:t>
+      </w:r>
+    </w:p>
+    <w:p>
+      <w:pPr>
+        <w:spacing w:before="200"/>
+      </w:pPr>
+      <w:r>
+        <w:t xml:space="preserve">This is what came out. The README tells you everything you need to operate it — including the two workflows, which is the part I care about.</w:t>
+      </w:r>
+    </w:p>
+    <w:p>
+      <w:pPr>
+        <w:spacing w:before="200"/>
+      </w:pPr>
+      <w:r>
+        <w:t xml:space="preserve">For a refactor, these tests pass and stay byte-identical. That's the whole contract.</w:t>
+      </w:r>
+    </w:p>
+    <w:p>
+      <w:pPr>
+        <w:spacing w:before="200"/>
+      </w:pPr>
+      <w:r>
+        <w:t xml:space="preserve">For a bugfix, behavior moves on purpose. Some of what's pinned here is acknowledged as wrong. Fixing it changes the snapshot, so the workflow is: pin the intended new behavior first, make the change, read every diff, then re-record.</w:t>
+      </w:r>
+    </w:p>
+    <w:p>
+      <w:pPr>
+        <w:spacing w:before="200"/>
+      </w:pPr>
+      <w:r>
+        <w:rPr>
+          <w:b/>
+          <w:i/>
+        </w:rPr>
+        <w:t xml:space="preserve">[Show `make char-record` refusing without `CONFIRM=1`.]</w:t>
+      </w:r>
+    </w:p>
+    <w:p>
+      <w:pPr>
+        <w:spacing w:before="200"/>
+      </w:pPr>
+      <w:r>
+        <w:t xml:space="preserve">It even guards the re-record command, because recording during a refactor is exactly how an unreviewed behavior change gets committed.</w:t>
+      </w:r>
+    </w:p>
+    <w:p>
+      <w:pPr>
+        <w:spacing w:before="200"/>
+      </w:pPr>
+      <w:r>
+        <w:rPr>
+          <w:b/>
+          <w:i/>
+        </w:rPr>
+        <w:t xml:space="preserve">[Open `evsc-agent-run/tests/characterization/cases/` and `baselines/`.]</w:t>
+      </w:r>
+    </w:p>
+    <w:p>
+      <w:pPr>
+        <w:spacing w:before="200"/>
+      </w:pPr>
+      <w:r>
+        <w:t xml:space="preserve">Cases and baselines. Twenty-six of them here, and going through it, fairly exhaustive.</w:t>
+      </w:r>
+    </w:p>
+    <w:p>
+      <w:pPr>
+        <w:spacing w:before="200"/>
+      </w:pPr>
+      <w:r>
+        <w:t xml:space="preserve">One honest note. I gave it license to be language-agnostic. It wrote the harness in bash. That is not my preference. I didn't think to specify, and this is what I got. In practice I'd push back and ask for Python or Node — or if the suite got slow enough to matter and it wasn't purely IO-bound, have it rewritten in something like Go.</w:t>
+      </w:r>
+    </w:p>
+    <w:p>
+      <w:pPr>
+        <w:spacing w:before="360"/>
+      </w:pPr>
+      <w:r>
+        <w:rPr>
+          <w:b/>
+        </w:rPr>
+        <w:t xml:space="preserve">Beat 6 — Test data</w:t>
+      </w:r>
+    </w:p>
+    <w:p>
+      <w:pPr>
+        <w:spacing w:before="200"/>
+      </w:pPr>
+      <w:r>
+        <w:rPr>
+          <w:b/>
+          <w:i/>
+        </w:rPr>
+        <w:t xml:space="preserve">[Marker: data.]</w:t>
+      </w:r>
+    </w:p>
+    <w:p>
+      <w:pPr>
+        <w:spacing w:before="200"/>
+      </w:pPr>
+      <w:r>
+        <w:rPr>
+          <w:b/>
+          <w:i/>
+        </w:rPr>
+        <w:t xml:space="preserve">[Paste the test data prompt.]</w:t>
+      </w:r>
+    </w:p>
+    <w:p>
+      <w:pPr>
+        <w:spacing w:before="200"/>
+      </w:pPr>
+      <w:r>
+        <w:t xml:space="preserve">Your test is only as good as its data.</w:t>
+      </w:r>
+    </w:p>
+    <w:p>
+      <w:pPr>
+        <w:spacing w:before="200"/>
+      </w:pPr>
+      <w:r>
+        <w:t xml:space="preserve">If you are able and allowed, give the agent read access to production-quality data and let it go find the real shapes — every state those messages actually show up in. That can take real time up front. And if you're going to commit the generated inputs, scrub them.</w:t>
+      </w:r>
+    </w:p>
+    <w:p>
+      <w:pPr>
+        <w:spacing w:before="200"/>
+      </w:pPr>
+      <w:r>
+        <w:t xml:space="preserve">If you don't have that access, property-based testing and fuzzing are your friends.</w:t>
+      </w:r>
+    </w:p>
+    <w:p>
+      <w:pPr>
+        <w:spacing w:before="200"/>
+      </w:pPr>
+      <w:r>
+        <w:rPr>
+          <w:b/>
+          <w:i/>
+        </w:rPr>
+        <w:t xml:space="preserve">[Open `evsc-agent-run/tests/property/`.]</w:t>
+      </w:r>
+    </w:p>
+    <w:p>
+      <w:pPr>
+        <w:spacing w:before="200"/>
+      </w:pPr>
+      <w:r>
+        <w:t xml:space="preserve">These will increase your total suite runtime by orders of magnitude. They're also how you test the limits of your candidate specification. Two of the defects in this repo were found by the property suite, not by anyone reading code — and then promoted into characterization cases twenty-five and twenty-six. That's the intended pipeline between the two.</w:t>
+      </w:r>
+    </w:p>
+    <w:p>
+      <w:pPr>
+        <w:spacing w:before="360"/>
+      </w:pPr>
+      <w:r>
+        <w:rPr>
+          <w:b/>
+        </w:rPr>
+        <w:t xml:space="preserve">Beat 7 — Green against unchanged code</w:t>
+      </w:r>
+    </w:p>
+    <w:p>
+      <w:pPr>
+        <w:spacing w:before="200"/>
+      </w:pPr>
+      <w:r>
+        <w:rPr>
+          <w:b/>
+          <w:i/>
+        </w:rPr>
+        <w:t xml:space="preserve">[Marker: verify.]</w:t>
+      </w:r>
+    </w:p>
+    <w:p>
+      <w:pPr>
+        <w:spacing w:before="200"/>
+      </w:pPr>
+      <w:r>
+        <w:t xml:space="preserve">My agent consistently generated the suite and ran it in the same turn. If yours doesn't, prompt for this explicitly, and make it the very next thing you do.</w:t>
+      </w:r>
+    </w:p>
+    <w:p>
+      <w:pPr>
+        <w:spacing w:before="200"/>
+      </w:pPr>
+      <w:r>
+        <w:rPr>
+          <w:b/>
+          <w:i/>
+        </w:rPr>
+        <w:t xml:space="preserve">[Paste the verification prompt.]</w:t>
+      </w:r>
+    </w:p>
+    <w:p>
+      <w:pPr>
+        <w:spacing w:before="200"/>
+      </w:pPr>
+      <w:r>
+        <w:t xml:space="preserve">Run the full suite against the current code, unmodified. Every assertion must pass. For any that doesn't, tell me whether the assertion is wrong or the documented behavior is wrong. Do not change application code to make a test pass.</w:t>
+      </w:r>
+    </w:p>
+    <w:p>
+      <w:pPr>
+        <w:spacing w:before="200"/>
+      </w:pPr>
+      <w:r>
+        <w:t xml:space="preserve">Until this is green you don't have a baseline. You have a hypothesis. A suite that has never passed can't tell you whether a later red is real — and *"oh, those were already failing"* is how a characterization effort quietly dies.</w:t>
+      </w:r>
+    </w:p>
+    <w:p>
+      <w:pPr>
+        <w:spacing w:before="200"/>
+      </w:pPr>
+      <w:r>
+        <w:t xml:space="preserve">This is the cheapest step in the whole workflow and the one most likely to get skipped.</w:t>
+      </w:r>
+    </w:p>
+    <w:p>
+      <w:pPr>
+        <w:spacing w:before="200"/>
+      </w:pPr>
+      <w:r>
+        <w:rPr>
+          <w:b/>
+          <w:i/>
+        </w:rPr>
+        <w:t xml:space="preserve">[Recording gap. If the drop is visible on screen:]</w:t>
+      </w:r>
+      <w:r>
+        <w:t xml:space="preserve"> The recorder dropped the next couple of prompts. They're in </w:t>
+      </w:r>
+      <w:r>
+        <w:rPr>
+          <w:rFonts w:ascii="Courier New" w:hAnsi="Courier New"/>
+        </w:rPr>
+        <w:t xml:space="preserve">PROMPTS.md</w:t>
+      </w:r>
+      <w:r>
+        <w:t xml:space="preserve">, which is in the repo behind the QR code at the end.</w:t>
+      </w:r>
+    </w:p>
+    <w:p>
+      <w:pPr>
+        <w:spacing w:before="360"/>
+      </w:pPr>
+      <w:r>
+        <w:rPr>
+          <w:b/>
+        </w:rPr>
+        <w:t xml:space="preserve">Beat 8 — The specification</w:t>
+      </w:r>
+    </w:p>
+    <w:p>
+      <w:pPr>
+        <w:spacing w:before="200"/>
+      </w:pPr>
+      <w:r>
+        <w:rPr>
+          <w:b/>
+          <w:i/>
+        </w:rPr>
+        <w:t xml:space="preserve">[Marker: spec.]</w:t>
+      </w:r>
+    </w:p>
+    <w:p>
+      <w:pPr>
+        <w:spacing w:before="200"/>
+      </w:pPr>
+      <w:r>
+        <w:t xml:space="preserve">This is the artifact we've been driving at the whole time. And note what's happening: we're generating it from behavior, while the behavior is held in place.</w:t>
+      </w:r>
+    </w:p>
+    <w:p>
+      <w:pPr>
+        <w:spacing w:before="200"/>
+      </w:pPr>
+      <w:r>
+        <w:rPr>
+          <w:b/>
+          <w:i/>
+        </w:rPr>
+        <w:t xml:space="preserve">[Paste the spec prompt.]</w:t>
+      </w:r>
+    </w:p>
+    <w:p>
+      <w:pPr>
+        <w:spacing w:before="200"/>
+      </w:pPr>
+      <w:r>
+        <w:t xml:space="preserve">Based on the code and the characterization tests, define what must remain true no matter what else changes, in order to preserve system stability. Split it into functional and non-functional requirements. Then add a section covering obvious bugs, potential latent bugs, and questionable behavior that something may be depending on.</w:t>
+      </w:r>
+    </w:p>
+    <w:p>
+      <w:pPr>
+        <w:spacing w:before="200"/>
+      </w:pPr>
+      <w:r>
+        <w:rPr>
+          <w:b/>
+          <w:i/>
+        </w:rPr>
+        <w:t xml:space="preserve">[Open `evsc-agent-run/docs/stability-spec.md`.]</w:t>
+      </w:r>
+    </w:p>
+    <w:p>
+      <w:pPr>
+        <w:spacing w:before="200"/>
+      </w:pPr>
+      <w:r>
+        <w:t xml:space="preserve">Seventy-five numbered requirements, each with a status and its evidence.</w:t>
+      </w:r>
+    </w:p>
+    <w:p>
+      <w:pPr>
+        <w:spacing w:before="200"/>
+      </w:pPr>
+      <w:r>
+        <w:t xml:space="preserve">And then the section that matters most for what comes next. Obvious bugs. Latent bugs — hazards that only appear once you change something specific. And questionable behavior that consumers may already be standing on.</w:t>
+      </w:r>
+    </w:p>
+    <w:p>
+      <w:pPr>
+        <w:spacing w:before="200"/>
+      </w:pPr>
+      <w:r>
+        <w:t xml:space="preserve">Verify this. Look at it. Take an interest in the things that look wrong.</w:t>
+      </w:r>
+    </w:p>
+    <w:p>
+      <w:pPr>
+        <w:spacing w:before="200"/>
+      </w:pPr>
+      <w:r>
+        <w:t xml:space="preserve">And we are not going to automatically change them. What's obviously wrong stays pinned, and gets documented right here. That's what buys us a clear path to fixing it later — on purpose, with the diff as the deliverable.</w:t>
+      </w:r>
+    </w:p>
+    <w:p>
+      <w:pPr>
+        <w:spacing w:before="200"/>
+      </w:pPr>
+      <w:r>
+        <w:t xml:space="preserve">This is also the document you put in front of an SME. Where the tests and the business disagree, you have probably found a bug — and possibly one something else depends on. Note it. Don't let it trigger an immediate change.</w:t>
+      </w:r>
+    </w:p>
+    <w:p>
+      <w:pPr>
+        <w:spacing w:before="360"/>
+      </w:pPr>
+      <w:r>
+        <w:rPr>
+          <w:b/>
+        </w:rPr>
+        <w:t xml:space="preserve">Beat 9 — Handing control back</w:t>
+      </w:r>
+    </w:p>
+    <w:p>
+      <w:pPr>
+        <w:spacing w:before="200"/>
+      </w:pPr>
+      <w:r>
+        <w:rPr>
+          <w:b/>
+          <w:i/>
+        </w:rPr>
+        <w:t xml:space="preserve">[Marker: makefile.]</w:t>
+      </w:r>
+    </w:p>
+    <w:p>
+      <w:pPr>
+        <w:spacing w:before="200"/>
+      </w:pPr>
+      <w:r>
+        <w:t xml:space="preserve">Last step, because I'm a stickler for determinism.</w:t>
+      </w:r>
+    </w:p>
+    <w:p>
+      <w:pPr>
+        <w:spacing w:before="200"/>
+      </w:pPr>
+      <w:r>
+        <w:rPr>
+          <w:b/>
+          <w:i/>
+        </w:rPr>
+        <w:t xml:space="preserve">[Paste the reproducibility prompt.]</w:t>
+      </w:r>
+    </w:p>
+    <w:p>
+      <w:pPr>
+        <w:spacing w:before="200"/>
+      </w:pPr>
+      <w:r>
+        <w:t xml:space="preserve">Wrap every core development command in a script — a Makefile or equivalent — and update the README, the tests README, and AGENTS.md.</w:t>
+      </w:r>
+    </w:p>
+    <w:p>
+      <w:pPr>
+        <w:spacing w:before="200"/>
+      </w:pPr>
+      <w:r>
+        <w:rPr>
+          <w:b/>
+          <w:i/>
+        </w:rPr>
+        <w:t xml:space="preserve">[Run `make` bare. Show the target list.]</w:t>
+      </w:r>
+    </w:p>
+    <w:p>
+      <w:pPr>
+        <w:spacing w:before="200"/>
+      </w:pPr>
+      <w:r>
+        <w:t xml:space="preserve">This is the handoff. You started with something inherently probabilistic that can read more of the system than you ever will. You end with a codified workflow, where the developer is in charge and in control.</w:t>
+      </w:r>
+    </w:p>
+    <w:p>
+      <w:pPr>
+        <w:spacing w:before="200"/>
+      </w:pPr>
+      <w:r>
+        <w:t xml:space="preserve">Commit these. Push them. Circulate them.</w:t>
+      </w:r>
+    </w:p>
+    <w:p>
+      <w:pPr>
+        <w:spacing w:before="200"/>
+      </w:pPr>
+      <w:r>
+        <w:t xml:space="preserve">Then start making changes.</w:t>
       </w:r>
     </w:p>
     <w:p>

</xml_diff>